<commit_message>
Thiết kế riêng cho môn Tiếng Anh và thêm ô nhập Week/Period
- english.js: loại tiết Global Success, khung PPP/PDP/TTT/TBLT, stage từng hoạt động,
  nhãn song ngữ, tự nhận loại tiết và Week/Period từ giáo án
- Schema: khối tieng_anh (Language analysis, Board plan, trọng tâm) + giai_doan_ta
- Word/HTML: đầu trang Subject–Grade · Week · Period, bảng Language analysis,
  Board plan, cột Stage trong Procedures, Assumptions dạng bảng
- Prompt: quy tắc soạn tiết tiếng Anh (stage theo loại tiết, CCQ/ICQ, IPA)
- Bộ kiểm tra: góp ý P3 cho tiết tiếng Anh thiếu stage / Language analysis / Board plan
- Trang web: ô Tuần · Week, Tiết PPCT · Period (tự tăng khi chọn nhiều tiết), loại tiết

Co-Authored-By: Claude Opus 5.5 <noreply@anthropic.com>
Claude-Session: https://claude.ai/code/session_013rNEKs6tcmtsXtauscuotv
</commit_message>
<xml_diff>
--- a/samples/output/TA7_Unit2_Lesson1_KHBD.docx
+++ b/samples/output/TA7_Unit2_Lesson1_KHBD.docx
@@ -104,7 +104,7 @@
                 <w:sz w:val="26"/>
                 <w:szCs w:val="26"/>
               </w:rPr>
-              <w:t xml:space="preserve">Môn: Tiếng Anh – Lớp 7</w:t>
+              <w:t xml:space="preserve">Subject: English – Grade 7</w:t>
             </w:r>
           </w:p>
           <w:p>
@@ -115,10 +115,12 @@
             <w:r>
               <w:rPr>
                 <w:rFonts w:ascii="Times New Roman" w:cs="Times New Roman" w:eastAsia="Times New Roman" w:hAnsi="Times New Roman"/>
+                <w:b/>
+                <w:bCs/>
                 <w:sz w:val="26"/>
                 <w:szCs w:val="26"/>
               </w:rPr>
-              <w:t xml:space="preserve">Tiết PPCT: ……   ·   Tuần: ……</w:t>
+              <w:t xml:space="preserve">Week: ……   ·   Period: ……</w:t>
             </w:r>
           </w:p>
           <w:p>
@@ -132,7 +134,7 @@
                 <w:sz w:val="26"/>
                 <w:szCs w:val="26"/>
               </w:rPr>
-              <w:t xml:space="preserve">Giáo viên: ……………………</w:t>
+              <w:t xml:space="preserve">Teacher: ……………………</w:t>
             </w:r>
           </w:p>
         </w:tc>
@@ -151,7 +153,7 @@
           <w:sz w:val="32"/>
           <w:szCs w:val="32"/>
         </w:rPr>
-        <w:t xml:space="preserve">KẾ HOẠCH BÀI DẠY</w:t>
+        <w:t xml:space="preserve">KẾ HOẠCH BÀI DẠY (LESSON PLAN)</w:t>
       </w:r>
     </w:p>
     <w:p>
@@ -172,6 +174,48 @@
     </w:p>
     <w:p>
       <w:pPr>
+        <w:spacing w:after="60" w:before="40" w:line="300" w:lineRule="auto"/>
+        <w:jc w:val="center"/>
+      </w:pPr>
+      <w:r>
+        <w:rPr>
+          <w:rFonts w:ascii="Times New Roman" w:cs="Times New Roman" w:eastAsia="Times New Roman" w:hAnsi="Times New Roman"/>
+          <w:b/>
+          <w:bCs/>
+          <w:sz w:val="26"/>
+          <w:szCs w:val="26"/>
+        </w:rPr>
+        <w:t xml:space="preserve">Lesson: </w:t>
+      </w:r>
+      <w:r>
+        <w:rPr>
+          <w:rFonts w:ascii="Times New Roman" w:cs="Times New Roman" w:eastAsia="Times New Roman" w:hAnsi="Times New Roman"/>
+          <w:sz w:val="26"/>
+          <w:szCs w:val="26"/>
+        </w:rPr>
+        <w:t xml:space="preserve">Getting Started</w:t>
+      </w:r>
+      <w:r>
+        <w:rPr>
+          <w:rFonts w:ascii="Times New Roman" w:cs="Times New Roman" w:eastAsia="Times New Roman" w:hAnsi="Times New Roman"/>
+          <w:b/>
+          <w:bCs/>
+          <w:sz w:val="26"/>
+          <w:szCs w:val="26"/>
+        </w:rPr>
+        <w:t xml:space="preserve">   ·   Framework: </w:t>
+      </w:r>
+      <w:r>
+        <w:rPr>
+          <w:rFonts w:ascii="Times New Roman" w:cs="Times New Roman" w:eastAsia="Times New Roman" w:hAnsi="Times New Roman"/>
+          <w:sz w:val="26"/>
+          <w:szCs w:val="26"/>
+        </w:rPr>
+        <w:t xml:space="preserve">PPP (Presentation – Practice – Production)</w:t>
+      </w:r>
+    </w:p>
+    <w:p>
+      <w:pPr>
         <w:spacing w:after="160" w:before="40" w:line="300" w:lineRule="auto"/>
         <w:jc w:val="center"/>
       </w:pPr>
@@ -225,7 +269,7 @@
           <w:sz w:val="28"/>
           <w:szCs w:val="28"/>
         </w:rPr>
-        <w:t xml:space="preserve">I. MỤC TIÊU</w:t>
+        <w:t xml:space="preserve">I. MỤC TIÊU (OBJECTIVES)</w:t>
       </w:r>
     </w:p>
     <w:p>
@@ -241,7 +285,7 @@
           <w:sz w:val="26"/>
           <w:szCs w:val="26"/>
         </w:rPr>
-        <w:t xml:space="preserve">1. Về kiến thức</w:t>
+        <w:t xml:space="preserve">1. Kiến thức (Knowledge)</w:t>
       </w:r>
     </w:p>
     <w:p>
@@ -321,7 +365,7 @@
           <w:sz w:val="26"/>
           <w:szCs w:val="26"/>
         </w:rPr>
-        <w:t xml:space="preserve">2. Về năng lực</w:t>
+        <w:t xml:space="preserve">2. Năng lực (Competences)</w:t>
       </w:r>
     </w:p>
     <w:p>
@@ -338,7 +382,7 @@
           <w:sz w:val="26"/>
           <w:szCs w:val="26"/>
         </w:rPr>
-        <w:t xml:space="preserve">a) Năng lực chung:</w:t>
+        <w:t xml:space="preserve">a) Năng lực chung (Core competences):</w:t>
       </w:r>
     </w:p>
     <w:p>
@@ -419,7 +463,7 @@
           <w:sz w:val="26"/>
           <w:szCs w:val="26"/>
         </w:rPr>
-        <w:t xml:space="preserve">b) Năng lực đặc thù:</w:t>
+        <w:t xml:space="preserve">b) Năng lực đặc thù (Language competences):</w:t>
       </w:r>
     </w:p>
     <w:p>
@@ -499,7 +543,7 @@
           <w:sz w:val="26"/>
           <w:szCs w:val="26"/>
         </w:rPr>
-        <w:t xml:space="preserve">3. Về phẩm chất</w:t>
+        <w:t xml:space="preserve">3. Phẩm chất (Personal qualities)</w:t>
       </w:r>
     </w:p>
     <w:p>
@@ -1002,7 +1046,7 @@
           <w:sz w:val="28"/>
           <w:szCs w:val="28"/>
         </w:rPr>
-        <w:t xml:space="preserve">II. THIẾT BỊ DẠY HỌC VÀ HỌC LIỆU</w:t>
+        <w:t xml:space="preserve">II. THIẾT BỊ DẠY HỌC VÀ HỌC LIỆU (MATERIALS)</w:t>
       </w:r>
     </w:p>
     <w:p>
@@ -1017,7 +1061,7 @@
           <w:sz w:val="26"/>
           <w:szCs w:val="26"/>
         </w:rPr>
-        <w:t xml:space="preserve">Giáo viên: </w:t>
+        <w:t xml:space="preserve">Teacher: </w:t>
       </w:r>
       <w:r>
         <w:rPr>
@@ -1040,7 +1084,7 @@
           <w:sz w:val="26"/>
           <w:szCs w:val="26"/>
         </w:rPr>
-        <w:t xml:space="preserve">Học sinh: </w:t>
+        <w:t xml:space="preserve">Students: </w:t>
       </w:r>
       <w:r>
         <w:rPr>
@@ -1051,6 +1095,1165 @@
         <w:t xml:space="preserve">SGK tr.18–19 (HD2, HD3, HD4, HD5); Bảng con theo cặp (HD2, HD3); Phiếu khảo sát, thẻ vai, giấy A3, rubric R1 (HD5, HD6)</w:t>
       </w:r>
     </w:p>
+    <w:p>
+      <w:pPr>
+        <w:spacing w:after="60" w:before="40" w:line="300" w:lineRule="auto"/>
+      </w:pPr>
+      <w:r>
+        <w:rPr>
+          <w:rFonts w:ascii="Times New Roman" w:cs="Times New Roman" w:eastAsia="Times New Roman" w:hAnsi="Times New Roman"/>
+          <w:b/>
+          <w:bCs/>
+          <w:sz w:val="26"/>
+          <w:szCs w:val="26"/>
+        </w:rPr>
+        <w:t xml:space="preserve">Language focus: </w:t>
+      </w:r>
+      <w:r>
+        <w:rPr>
+          <w:rFonts w:ascii="Times New Roman" w:cs="Times New Roman" w:eastAsia="Times New Roman" w:hAnsi="Times New Roman"/>
+          <w:sz w:val="26"/>
+          <w:szCs w:val="26"/>
+        </w:rPr>
+        <w:t xml:space="preserve">Vocabulary: healthy activities; talking about good/bad habits for health</w:t>
+      </w:r>
+    </w:p>
+    <w:p>
+      <w:pPr>
+        <w:keepNext/>
+        <w:spacing w:after="80" w:before="120" w:line="300" w:lineRule="auto"/>
+      </w:pPr>
+      <w:r>
+        <w:rPr>
+          <w:rFonts w:ascii="Times New Roman" w:cs="Times New Roman" w:eastAsia="Times New Roman" w:hAnsi="Times New Roman"/>
+          <w:b/>
+          <w:bCs/>
+          <w:sz w:val="26"/>
+          <w:szCs w:val="26"/>
+        </w:rPr>
+        <w:t xml:space="preserve">Phân tích ngôn ngữ (Language analysis)</w:t>
+      </w:r>
+    </w:p>
+    <w:tbl>
+      <w:tblPr>
+        <w:tblW w:type="dxa" w:w="9355"/>
+        <w:tblBorders>
+          <w:top w:val="single" w:color="808080" w:sz="4"/>
+          <w:left w:val="single" w:color="808080" w:sz="4"/>
+          <w:bottom w:val="single" w:color="808080" w:sz="4"/>
+          <w:right w:val="single" w:color="808080" w:sz="4"/>
+          <w:insideH w:val="single" w:color="808080" w:sz="4"/>
+          <w:insideV w:val="single" w:color="808080" w:sz="4"/>
+        </w:tblBorders>
+      </w:tblPr>
+      <w:tblGrid>
+        <w:gridCol w:w="2700"/>
+        <w:gridCol w:w="2100"/>
+        <w:gridCol w:w="2555"/>
+        <w:gridCol w:w="2000"/>
+      </w:tblGrid>
+      <w:tr>
+        <w:trPr>
+          <w:tblHeader/>
+        </w:trPr>
+        <w:tc>
+          <w:tcPr>
+            <w:tcW w:type="dxa" w:w="2700"/>
+            <w:shd w:fill="D9E2F3" w:color="auto" w:val="clear"/>
+            <w:tcMar>
+              <w:top w:type="dxa" w:w="60"/>
+              <w:left w:type="dxa" w:w="100"/>
+              <w:bottom w:type="dxa" w:w="60"/>
+              <w:right w:type="dxa" w:w="100"/>
+            </w:tcMar>
+            <w:vAlign w:val="top"/>
+          </w:tcPr>
+          <w:p>
+            <w:pPr>
+              <w:spacing w:after="60" w:before="40" w:line="300" w:lineRule="auto"/>
+              <w:jc w:val="center"/>
+            </w:pPr>
+            <w:r>
+              <w:rPr>
+                <w:rFonts w:ascii="Times New Roman" w:cs="Times New Roman" w:eastAsia="Times New Roman" w:hAnsi="Times New Roman"/>
+                <w:b/>
+                <w:bCs/>
+                <w:sz w:val="24"/>
+                <w:szCs w:val="24"/>
+              </w:rPr>
+              <w:t xml:space="preserve">Form</w:t>
+            </w:r>
+          </w:p>
+        </w:tc>
+        <w:tc>
+          <w:tcPr>
+            <w:tcW w:type="dxa" w:w="2100"/>
+            <w:shd w:fill="D9E2F3" w:color="auto" w:val="clear"/>
+            <w:tcMar>
+              <w:top w:type="dxa" w:w="60"/>
+              <w:left w:type="dxa" w:w="100"/>
+              <w:bottom w:type="dxa" w:w="60"/>
+              <w:right w:type="dxa" w:w="100"/>
+            </w:tcMar>
+            <w:vAlign w:val="top"/>
+          </w:tcPr>
+          <w:p>
+            <w:pPr>
+              <w:spacing w:after="60" w:before="40" w:line="300" w:lineRule="auto"/>
+              <w:jc w:val="center"/>
+            </w:pPr>
+            <w:r>
+              <w:rPr>
+                <w:rFonts w:ascii="Times New Roman" w:cs="Times New Roman" w:eastAsia="Times New Roman" w:hAnsi="Times New Roman"/>
+                <w:b/>
+                <w:bCs/>
+                <w:sz w:val="24"/>
+                <w:szCs w:val="24"/>
+              </w:rPr>
+              <w:t xml:space="preserve">Pronunciation</w:t>
+            </w:r>
+          </w:p>
+        </w:tc>
+        <w:tc>
+          <w:tcPr>
+            <w:tcW w:type="dxa" w:w="2555"/>
+            <w:shd w:fill="D9E2F3" w:color="auto" w:val="clear"/>
+            <w:tcMar>
+              <w:top w:type="dxa" w:w="60"/>
+              <w:left w:type="dxa" w:w="100"/>
+              <w:bottom w:type="dxa" w:w="60"/>
+              <w:right w:type="dxa" w:w="100"/>
+            </w:tcMar>
+            <w:vAlign w:val="top"/>
+          </w:tcPr>
+          <w:p>
+            <w:pPr>
+              <w:spacing w:after="60" w:before="40" w:line="300" w:lineRule="auto"/>
+              <w:jc w:val="center"/>
+            </w:pPr>
+            <w:r>
+              <w:rPr>
+                <w:rFonts w:ascii="Times New Roman" w:cs="Times New Roman" w:eastAsia="Times New Roman" w:hAnsi="Times New Roman"/>
+                <w:b/>
+                <w:bCs/>
+                <w:sz w:val="24"/>
+                <w:szCs w:val="24"/>
+              </w:rPr>
+              <w:t xml:space="preserve">Meaning</w:t>
+            </w:r>
+          </w:p>
+        </w:tc>
+        <w:tc>
+          <w:tcPr>
+            <w:tcW w:type="dxa" w:w="2000"/>
+            <w:shd w:fill="D9E2F3" w:color="auto" w:val="clear"/>
+            <w:tcMar>
+              <w:top w:type="dxa" w:w="60"/>
+              <w:left w:type="dxa" w:w="100"/>
+              <w:bottom w:type="dxa" w:w="60"/>
+              <w:right w:type="dxa" w:w="100"/>
+            </w:tcMar>
+            <w:vAlign w:val="top"/>
+          </w:tcPr>
+          <w:p>
+            <w:pPr>
+              <w:spacing w:after="60" w:before="40" w:line="300" w:lineRule="auto"/>
+              <w:jc w:val="center"/>
+            </w:pPr>
+            <w:r>
+              <w:rPr>
+                <w:rFonts w:ascii="Times New Roman" w:cs="Times New Roman" w:eastAsia="Times New Roman" w:hAnsi="Times New Roman"/>
+                <w:b/>
+                <w:bCs/>
+                <w:sz w:val="24"/>
+                <w:szCs w:val="24"/>
+              </w:rPr>
+              <w:t xml:space="preserve">Vietnamese equivalent</w:t>
+            </w:r>
+          </w:p>
+        </w:tc>
+      </w:tr>
+      <w:tr>
+        <w:trPr>
+          <w:tblHeader w:val="off"/>
+        </w:trPr>
+        <w:tc>
+          <w:tcPr>
+            <w:tcW w:type="dxa" w:w="2700"/>
+            <w:tcMar>
+              <w:top w:type="dxa" w:w="60"/>
+              <w:left w:type="dxa" w:w="100"/>
+              <w:bottom w:type="dxa" w:w="60"/>
+              <w:right w:type="dxa" w:w="100"/>
+            </w:tcMar>
+            <w:vAlign w:val="top"/>
+          </w:tcPr>
+          <w:p>
+            <w:pPr>
+              <w:spacing w:after="60" w:before="40" w:line="300" w:lineRule="auto"/>
+            </w:pPr>
+            <w:r>
+              <w:rPr>
+                <w:rFonts w:ascii="Times New Roman" w:cs="Times New Roman" w:eastAsia="Times New Roman" w:hAnsi="Times New Roman"/>
+                <w:sz w:val="22"/>
+                <w:szCs w:val="22"/>
+              </w:rPr>
+              <w:t xml:space="preserve">popular (a)</w:t>
+            </w:r>
+          </w:p>
+        </w:tc>
+        <w:tc>
+          <w:tcPr>
+            <w:tcW w:type="dxa" w:w="2100"/>
+            <w:tcMar>
+              <w:top w:type="dxa" w:w="60"/>
+              <w:left w:type="dxa" w:w="100"/>
+              <w:bottom w:type="dxa" w:w="60"/>
+              <w:right w:type="dxa" w:w="100"/>
+            </w:tcMar>
+            <w:vAlign w:val="top"/>
+          </w:tcPr>
+          <w:p>
+            <w:pPr>
+              <w:spacing w:after="60" w:before="40" w:line="300" w:lineRule="auto"/>
+            </w:pPr>
+            <w:r>
+              <w:rPr>
+                <w:rFonts w:ascii="Times New Roman" w:cs="Times New Roman" w:eastAsia="Times New Roman" w:hAnsi="Times New Roman"/>
+                <w:sz w:val="22"/>
+                <w:szCs w:val="22"/>
+              </w:rPr>
+              <w:t xml:space="preserve">/ˈpɒpjələr/</w:t>
+            </w:r>
+          </w:p>
+        </w:tc>
+        <w:tc>
+          <w:tcPr>
+            <w:tcW w:type="dxa" w:w="2555"/>
+            <w:tcMar>
+              <w:top w:type="dxa" w:w="60"/>
+              <w:left w:type="dxa" w:w="100"/>
+              <w:bottom w:type="dxa" w:w="60"/>
+              <w:right w:type="dxa" w:w="100"/>
+            </w:tcMar>
+            <w:vAlign w:val="top"/>
+          </w:tcPr>
+          <w:p>
+            <w:pPr>
+              <w:spacing w:after="60" w:before="40" w:line="300" w:lineRule="auto"/>
+            </w:pPr>
+            <w:r>
+              <w:rPr>
+                <w:rFonts w:ascii="Times New Roman" w:cs="Times New Roman" w:eastAsia="Times New Roman" w:hAnsi="Times New Roman"/>
+                <w:sz w:val="22"/>
+                <w:szCs w:val="22"/>
+              </w:rPr>
+              <w:t xml:space="preserve">liked, enjoyed, or supported by many people</w:t>
+            </w:r>
+          </w:p>
+        </w:tc>
+        <w:tc>
+          <w:tcPr>
+            <w:tcW w:type="dxa" w:w="2000"/>
+            <w:tcMar>
+              <w:top w:type="dxa" w:w="60"/>
+              <w:left w:type="dxa" w:w="100"/>
+              <w:bottom w:type="dxa" w:w="60"/>
+              <w:right w:type="dxa" w:w="100"/>
+            </w:tcMar>
+            <w:vAlign w:val="top"/>
+          </w:tcPr>
+          <w:p>
+            <w:pPr>
+              <w:spacing w:after="60" w:before="40" w:line="300" w:lineRule="auto"/>
+            </w:pPr>
+            <w:r>
+              <w:rPr>
+                <w:rFonts w:ascii="Times New Roman" w:cs="Times New Roman" w:eastAsia="Times New Roman" w:hAnsi="Times New Roman"/>
+                <w:sz w:val="22"/>
+                <w:szCs w:val="22"/>
+              </w:rPr>
+              <w:t xml:space="preserve">phổ biến</w:t>
+            </w:r>
+          </w:p>
+        </w:tc>
+      </w:tr>
+      <w:tr>
+        <w:trPr>
+          <w:tblHeader w:val="off"/>
+        </w:trPr>
+        <w:tc>
+          <w:tcPr>
+            <w:tcW w:type="dxa" w:w="2700"/>
+            <w:tcMar>
+              <w:top w:type="dxa" w:w="60"/>
+              <w:left w:type="dxa" w:w="100"/>
+              <w:bottom w:type="dxa" w:w="60"/>
+              <w:right w:type="dxa" w:w="100"/>
+            </w:tcMar>
+            <w:vAlign w:val="top"/>
+          </w:tcPr>
+          <w:p>
+            <w:pPr>
+              <w:spacing w:after="60" w:before="40" w:line="300" w:lineRule="auto"/>
+            </w:pPr>
+            <w:r>
+              <w:rPr>
+                <w:rFonts w:ascii="Times New Roman" w:cs="Times New Roman" w:eastAsia="Times New Roman" w:hAnsi="Times New Roman"/>
+                <w:sz w:val="22"/>
+                <w:szCs w:val="22"/>
+              </w:rPr>
+              <w:t xml:space="preserve">fresh (a)</w:t>
+            </w:r>
+          </w:p>
+        </w:tc>
+        <w:tc>
+          <w:tcPr>
+            <w:tcW w:type="dxa" w:w="2100"/>
+            <w:tcMar>
+              <w:top w:type="dxa" w:w="60"/>
+              <w:left w:type="dxa" w:w="100"/>
+              <w:bottom w:type="dxa" w:w="60"/>
+              <w:right w:type="dxa" w:w="100"/>
+            </w:tcMar>
+            <w:vAlign w:val="top"/>
+          </w:tcPr>
+          <w:p>
+            <w:pPr>
+              <w:spacing w:after="60" w:before="40" w:line="300" w:lineRule="auto"/>
+            </w:pPr>
+            <w:r>
+              <w:rPr>
+                <w:rFonts w:ascii="Times New Roman" w:cs="Times New Roman" w:eastAsia="Times New Roman" w:hAnsi="Times New Roman"/>
+                <w:sz w:val="22"/>
+                <w:szCs w:val="22"/>
+              </w:rPr>
+              <w:t xml:space="preserve">/freʃ/</w:t>
+            </w:r>
+          </w:p>
+        </w:tc>
+        <w:tc>
+          <w:tcPr>
+            <w:tcW w:type="dxa" w:w="2555"/>
+            <w:tcMar>
+              <w:top w:type="dxa" w:w="60"/>
+              <w:left w:type="dxa" w:w="100"/>
+              <w:bottom w:type="dxa" w:w="60"/>
+              <w:right w:type="dxa" w:w="100"/>
+            </w:tcMar>
+            <w:vAlign w:val="top"/>
+          </w:tcPr>
+          <w:p>
+            <w:pPr>
+              <w:spacing w:after="60" w:before="40" w:line="300" w:lineRule="auto"/>
+            </w:pPr>
+            <w:r>
+              <w:rPr>
+                <w:rFonts w:ascii="Times New Roman" w:cs="Times New Roman" w:eastAsia="Times New Roman" w:hAnsi="Times New Roman"/>
+                <w:sz w:val="22"/>
+                <w:szCs w:val="22"/>
+              </w:rPr>
+              <w:t xml:space="preserve">new or different</w:t>
+            </w:r>
+          </w:p>
+        </w:tc>
+        <w:tc>
+          <w:tcPr>
+            <w:tcW w:type="dxa" w:w="2000"/>
+            <w:tcMar>
+              <w:top w:type="dxa" w:w="60"/>
+              <w:left w:type="dxa" w:w="100"/>
+              <w:bottom w:type="dxa" w:w="60"/>
+              <w:right w:type="dxa" w:w="100"/>
+            </w:tcMar>
+            <w:vAlign w:val="top"/>
+          </w:tcPr>
+          <w:p>
+            <w:pPr>
+              <w:spacing w:after="60" w:before="40" w:line="300" w:lineRule="auto"/>
+            </w:pPr>
+            <w:r>
+              <w:rPr>
+                <w:rFonts w:ascii="Times New Roman" w:cs="Times New Roman" w:eastAsia="Times New Roman" w:hAnsi="Times New Roman"/>
+                <w:sz w:val="22"/>
+                <w:szCs w:val="22"/>
+              </w:rPr>
+              <w:t xml:space="preserve">tươi, mới</w:t>
+            </w:r>
+          </w:p>
+        </w:tc>
+      </w:tr>
+      <w:tr>
+        <w:trPr>
+          <w:tblHeader w:val="off"/>
+        </w:trPr>
+        <w:tc>
+          <w:tcPr>
+            <w:tcW w:type="dxa" w:w="2700"/>
+            <w:tcMar>
+              <w:top w:type="dxa" w:w="60"/>
+              <w:left w:type="dxa" w:w="100"/>
+              <w:bottom w:type="dxa" w:w="60"/>
+              <w:right w:type="dxa" w:w="100"/>
+            </w:tcMar>
+            <w:vAlign w:val="top"/>
+          </w:tcPr>
+          <w:p>
+            <w:pPr>
+              <w:spacing w:after="60" w:before="40" w:line="300" w:lineRule="auto"/>
+            </w:pPr>
+            <w:r>
+              <w:rPr>
+                <w:rFonts w:ascii="Times New Roman" w:cs="Times New Roman" w:eastAsia="Times New Roman" w:hAnsi="Times New Roman"/>
+                <w:sz w:val="22"/>
+                <w:szCs w:val="22"/>
+              </w:rPr>
+              <w:t xml:space="preserve">join (v)</w:t>
+            </w:r>
+          </w:p>
+        </w:tc>
+        <w:tc>
+          <w:tcPr>
+            <w:tcW w:type="dxa" w:w="2100"/>
+            <w:tcMar>
+              <w:top w:type="dxa" w:w="60"/>
+              <w:left w:type="dxa" w:w="100"/>
+              <w:bottom w:type="dxa" w:w="60"/>
+              <w:right w:type="dxa" w:w="100"/>
+            </w:tcMar>
+            <w:vAlign w:val="top"/>
+          </w:tcPr>
+          <w:p>
+            <w:pPr>
+              <w:spacing w:after="60" w:before="40" w:line="300" w:lineRule="auto"/>
+            </w:pPr>
+            <w:r>
+              <w:rPr>
+                <w:rFonts w:ascii="Times New Roman" w:cs="Times New Roman" w:eastAsia="Times New Roman" w:hAnsi="Times New Roman"/>
+                <w:sz w:val="22"/>
+                <w:szCs w:val="22"/>
+              </w:rPr>
+              <w:t xml:space="preserve">/dʒɔɪn/</w:t>
+            </w:r>
+          </w:p>
+        </w:tc>
+        <w:tc>
+          <w:tcPr>
+            <w:tcW w:type="dxa" w:w="2555"/>
+            <w:tcMar>
+              <w:top w:type="dxa" w:w="60"/>
+              <w:left w:type="dxa" w:w="100"/>
+              <w:bottom w:type="dxa" w:w="60"/>
+              <w:right w:type="dxa" w:w="100"/>
+            </w:tcMar>
+            <w:vAlign w:val="top"/>
+          </w:tcPr>
+          <w:p>
+            <w:pPr>
+              <w:spacing w:after="60" w:before="40" w:line="300" w:lineRule="auto"/>
+            </w:pPr>
+            <w:r>
+              <w:rPr>
+                <w:rFonts w:ascii="Times New Roman" w:cs="Times New Roman" w:eastAsia="Times New Roman" w:hAnsi="Times New Roman"/>
+                <w:sz w:val="22"/>
+                <w:szCs w:val="22"/>
+              </w:rPr>
+              <w:t xml:space="preserve">to do an activity together with others</w:t>
+            </w:r>
+          </w:p>
+        </w:tc>
+        <w:tc>
+          <w:tcPr>
+            <w:tcW w:type="dxa" w:w="2000"/>
+            <w:tcMar>
+              <w:top w:type="dxa" w:w="60"/>
+              <w:left w:type="dxa" w:w="100"/>
+              <w:bottom w:type="dxa" w:w="60"/>
+              <w:right w:type="dxa" w:w="100"/>
+            </w:tcMar>
+            <w:vAlign w:val="top"/>
+          </w:tcPr>
+          <w:p>
+            <w:pPr>
+              <w:spacing w:after="60" w:before="40" w:line="300" w:lineRule="auto"/>
+            </w:pPr>
+            <w:r>
+              <w:rPr>
+                <w:rFonts w:ascii="Times New Roman" w:cs="Times New Roman" w:eastAsia="Times New Roman" w:hAnsi="Times New Roman"/>
+                <w:sz w:val="22"/>
+                <w:szCs w:val="22"/>
+              </w:rPr>
+              <w:t xml:space="preserve">tham gia</w:t>
+            </w:r>
+          </w:p>
+        </w:tc>
+      </w:tr>
+      <w:tr>
+        <w:trPr>
+          <w:tblHeader w:val="off"/>
+        </w:trPr>
+        <w:tc>
+          <w:tcPr>
+            <w:tcW w:type="dxa" w:w="2700"/>
+            <w:tcMar>
+              <w:top w:type="dxa" w:w="60"/>
+              <w:left w:type="dxa" w:w="100"/>
+              <w:bottom w:type="dxa" w:w="60"/>
+              <w:right w:type="dxa" w:w="100"/>
+            </w:tcMar>
+            <w:vAlign w:val="top"/>
+          </w:tcPr>
+          <w:p>
+            <w:pPr>
+              <w:spacing w:after="60" w:before="40" w:line="300" w:lineRule="auto"/>
+            </w:pPr>
+            <w:r>
+              <w:rPr>
+                <w:rFonts w:ascii="Times New Roman" w:cs="Times New Roman" w:eastAsia="Times New Roman" w:hAnsi="Times New Roman"/>
+                <w:sz w:val="22"/>
+                <w:szCs w:val="22"/>
+              </w:rPr>
+              <w:t xml:space="preserve">sunburn (n)</w:t>
+            </w:r>
+          </w:p>
+        </w:tc>
+        <w:tc>
+          <w:tcPr>
+            <w:tcW w:type="dxa" w:w="2100"/>
+            <w:tcMar>
+              <w:top w:type="dxa" w:w="60"/>
+              <w:left w:type="dxa" w:w="100"/>
+              <w:bottom w:type="dxa" w:w="60"/>
+              <w:right w:type="dxa" w:w="100"/>
+            </w:tcMar>
+            <w:vAlign w:val="top"/>
+          </w:tcPr>
+          <w:p>
+            <w:pPr>
+              <w:spacing w:after="60" w:before="40" w:line="300" w:lineRule="auto"/>
+            </w:pPr>
+            <w:r>
+              <w:rPr>
+                <w:rFonts w:ascii="Times New Roman" w:cs="Times New Roman" w:eastAsia="Times New Roman" w:hAnsi="Times New Roman"/>
+                <w:sz w:val="22"/>
+                <w:szCs w:val="22"/>
+              </w:rPr>
+              <w:t xml:space="preserve">/ˈsʌnbɜːn/</w:t>
+            </w:r>
+          </w:p>
+        </w:tc>
+        <w:tc>
+          <w:tcPr>
+            <w:tcW w:type="dxa" w:w="2555"/>
+            <w:tcMar>
+              <w:top w:type="dxa" w:w="60"/>
+              <w:left w:type="dxa" w:w="100"/>
+              <w:bottom w:type="dxa" w:w="60"/>
+              <w:right w:type="dxa" w:w="100"/>
+            </w:tcMar>
+            <w:vAlign w:val="top"/>
+          </w:tcPr>
+          <w:p>
+            <w:pPr>
+              <w:spacing w:after="60" w:before="40" w:line="300" w:lineRule="auto"/>
+            </w:pPr>
+            <w:r>
+              <w:rPr>
+                <w:rFonts w:ascii="Times New Roman" w:cs="Times New Roman" w:eastAsia="Times New Roman" w:hAnsi="Times New Roman"/>
+                <w:sz w:val="22"/>
+                <w:szCs w:val="22"/>
+              </w:rPr>
+              <w:t xml:space="preserve">red, painful skin from too much sun</w:t>
+            </w:r>
+          </w:p>
+        </w:tc>
+        <w:tc>
+          <w:tcPr>
+            <w:tcW w:type="dxa" w:w="2000"/>
+            <w:tcMar>
+              <w:top w:type="dxa" w:w="60"/>
+              <w:left w:type="dxa" w:w="100"/>
+              <w:bottom w:type="dxa" w:w="60"/>
+              <w:right w:type="dxa" w:w="100"/>
+            </w:tcMar>
+            <w:vAlign w:val="top"/>
+          </w:tcPr>
+          <w:p>
+            <w:pPr>
+              <w:spacing w:after="60" w:before="40" w:line="300" w:lineRule="auto"/>
+            </w:pPr>
+            <w:r>
+              <w:rPr>
+                <w:rFonts w:ascii="Times New Roman" w:cs="Times New Roman" w:eastAsia="Times New Roman" w:hAnsi="Times New Roman"/>
+                <w:sz w:val="22"/>
+                <w:szCs w:val="22"/>
+              </w:rPr>
+              <w:t xml:space="preserve">cháy nắng</w:t>
+            </w:r>
+          </w:p>
+        </w:tc>
+      </w:tr>
+      <w:tr>
+        <w:trPr>
+          <w:tblHeader w:val="off"/>
+        </w:trPr>
+        <w:tc>
+          <w:tcPr>
+            <w:tcW w:type="dxa" w:w="2700"/>
+            <w:tcMar>
+              <w:top w:type="dxa" w:w="60"/>
+              <w:left w:type="dxa" w:w="100"/>
+              <w:bottom w:type="dxa" w:w="60"/>
+              <w:right w:type="dxa" w:w="100"/>
+            </w:tcMar>
+            <w:vAlign w:val="top"/>
+          </w:tcPr>
+          <w:p>
+            <w:pPr>
+              <w:spacing w:after="60" w:before="40" w:line="300" w:lineRule="auto"/>
+            </w:pPr>
+            <w:r>
+              <w:rPr>
+                <w:rFonts w:ascii="Times New Roman" w:cs="Times New Roman" w:eastAsia="Times New Roman" w:hAnsi="Times New Roman"/>
+                <w:sz w:val="22"/>
+                <w:szCs w:val="22"/>
+              </w:rPr>
+              <w:t xml:space="preserve">suncream (n)</w:t>
+            </w:r>
+          </w:p>
+        </w:tc>
+        <w:tc>
+          <w:tcPr>
+            <w:tcW w:type="dxa" w:w="2100"/>
+            <w:tcMar>
+              <w:top w:type="dxa" w:w="60"/>
+              <w:left w:type="dxa" w:w="100"/>
+              <w:bottom w:type="dxa" w:w="60"/>
+              <w:right w:type="dxa" w:w="100"/>
+            </w:tcMar>
+            <w:vAlign w:val="top"/>
+          </w:tcPr>
+          <w:p>
+            <w:pPr>
+              <w:spacing w:after="60" w:before="40" w:line="300" w:lineRule="auto"/>
+            </w:pPr>
+            <w:r>
+              <w:rPr>
+                <w:rFonts w:ascii="Times New Roman" w:cs="Times New Roman" w:eastAsia="Times New Roman" w:hAnsi="Times New Roman"/>
+                <w:sz w:val="22"/>
+                <w:szCs w:val="22"/>
+              </w:rPr>
+              <w:t xml:space="preserve">/ˈsʌnkriːm/</w:t>
+            </w:r>
+          </w:p>
+        </w:tc>
+        <w:tc>
+          <w:tcPr>
+            <w:tcW w:type="dxa" w:w="2555"/>
+            <w:tcMar>
+              <w:top w:type="dxa" w:w="60"/>
+              <w:left w:type="dxa" w:w="100"/>
+              <w:bottom w:type="dxa" w:w="60"/>
+              <w:right w:type="dxa" w:w="100"/>
+            </w:tcMar>
+            <w:vAlign w:val="top"/>
+          </w:tcPr>
+          <w:p>
+            <w:pPr>
+              <w:spacing w:after="60" w:before="40" w:line="300" w:lineRule="auto"/>
+            </w:pPr>
+            <w:r>
+              <w:rPr>
+                <w:rFonts w:ascii="Times New Roman" w:cs="Times New Roman" w:eastAsia="Times New Roman" w:hAnsi="Times New Roman"/>
+                <w:sz w:val="22"/>
+                <w:szCs w:val="22"/>
+              </w:rPr>
+              <w:t xml:space="preserve">cream that protects skin from the sun</w:t>
+            </w:r>
+          </w:p>
+        </w:tc>
+        <w:tc>
+          <w:tcPr>
+            <w:tcW w:type="dxa" w:w="2000"/>
+            <w:tcMar>
+              <w:top w:type="dxa" w:w="60"/>
+              <w:left w:type="dxa" w:w="100"/>
+              <w:bottom w:type="dxa" w:w="60"/>
+              <w:right w:type="dxa" w:w="100"/>
+            </w:tcMar>
+            <w:vAlign w:val="top"/>
+          </w:tcPr>
+          <w:p>
+            <w:pPr>
+              <w:spacing w:after="60" w:before="40" w:line="300" w:lineRule="auto"/>
+            </w:pPr>
+            <w:r>
+              <w:rPr>
+                <w:rFonts w:ascii="Times New Roman" w:cs="Times New Roman" w:eastAsia="Times New Roman" w:hAnsi="Times New Roman"/>
+                <w:sz w:val="22"/>
+                <w:szCs w:val="22"/>
+              </w:rPr>
+              <w:t xml:space="preserve">kem chống nắng</w:t>
+            </w:r>
+          </w:p>
+        </w:tc>
+      </w:tr>
+      <w:tr>
+        <w:trPr>
+          <w:tblHeader w:val="off"/>
+        </w:trPr>
+        <w:tc>
+          <w:tcPr>
+            <w:tcW w:type="dxa" w:w="2700"/>
+            <w:tcMar>
+              <w:top w:type="dxa" w:w="60"/>
+              <w:left w:type="dxa" w:w="100"/>
+              <w:bottom w:type="dxa" w:w="60"/>
+              <w:right w:type="dxa" w:w="100"/>
+            </w:tcMar>
+            <w:vAlign w:val="top"/>
+          </w:tcPr>
+          <w:p>
+            <w:pPr>
+              <w:spacing w:after="60" w:before="40" w:line="300" w:lineRule="auto"/>
+            </w:pPr>
+            <w:r>
+              <w:rPr>
+                <w:rFonts w:ascii="Times New Roman" w:cs="Times New Roman" w:eastAsia="Times New Roman" w:hAnsi="Times New Roman"/>
+                <w:sz w:val="22"/>
+                <w:szCs w:val="22"/>
+              </w:rPr>
+              <w:t xml:space="preserve">lunch box (n)</w:t>
+            </w:r>
+          </w:p>
+        </w:tc>
+        <w:tc>
+          <w:tcPr>
+            <w:tcW w:type="dxa" w:w="2100"/>
+            <w:tcMar>
+              <w:top w:type="dxa" w:w="60"/>
+              <w:left w:type="dxa" w:w="100"/>
+              <w:bottom w:type="dxa" w:w="60"/>
+              <w:right w:type="dxa" w:w="100"/>
+            </w:tcMar>
+            <w:vAlign w:val="top"/>
+          </w:tcPr>
+          <w:p>
+            <w:pPr>
+              <w:spacing w:after="60" w:before="40" w:line="300" w:lineRule="auto"/>
+            </w:pPr>
+            <w:r>
+              <w:rPr>
+                <w:rFonts w:ascii="Times New Roman" w:cs="Times New Roman" w:eastAsia="Times New Roman" w:hAnsi="Times New Roman"/>
+                <w:sz w:val="22"/>
+                <w:szCs w:val="22"/>
+              </w:rPr>
+              <w:t xml:space="preserve">/ˈlʌntʃ bɒks/</w:t>
+            </w:r>
+          </w:p>
+        </w:tc>
+        <w:tc>
+          <w:tcPr>
+            <w:tcW w:type="dxa" w:w="2555"/>
+            <w:tcMar>
+              <w:top w:type="dxa" w:w="60"/>
+              <w:left w:type="dxa" w:w="100"/>
+              <w:bottom w:type="dxa" w:w="60"/>
+              <w:right w:type="dxa" w:w="100"/>
+            </w:tcMar>
+            <w:vAlign w:val="top"/>
+          </w:tcPr>
+          <w:p>
+            <w:pPr>
+              <w:spacing w:after="60" w:before="40" w:line="300" w:lineRule="auto"/>
+            </w:pPr>
+            <w:r>
+              <w:rPr>
+                <w:rFonts w:ascii="Times New Roman" w:cs="Times New Roman" w:eastAsia="Times New Roman" w:hAnsi="Times New Roman"/>
+                <w:sz w:val="22"/>
+                <w:szCs w:val="22"/>
+              </w:rPr>
+              <w:t xml:space="preserve">a box for carrying lunch</w:t>
+            </w:r>
+          </w:p>
+        </w:tc>
+        <w:tc>
+          <w:tcPr>
+            <w:tcW w:type="dxa" w:w="2000"/>
+            <w:tcMar>
+              <w:top w:type="dxa" w:w="60"/>
+              <w:left w:type="dxa" w:w="100"/>
+              <w:bottom w:type="dxa" w:w="60"/>
+              <w:right w:type="dxa" w:w="100"/>
+            </w:tcMar>
+            <w:vAlign w:val="top"/>
+          </w:tcPr>
+          <w:p>
+            <w:pPr>
+              <w:spacing w:after="60" w:before="40" w:line="300" w:lineRule="auto"/>
+            </w:pPr>
+            <w:r>
+              <w:rPr>
+                <w:rFonts w:ascii="Times New Roman" w:cs="Times New Roman" w:eastAsia="Times New Roman" w:hAnsi="Times New Roman"/>
+                <w:sz w:val="22"/>
+                <w:szCs w:val="22"/>
+              </w:rPr>
+              <w:t xml:space="preserve">hộp cơm trưa</w:t>
+            </w:r>
+          </w:p>
+        </w:tc>
+      </w:tr>
+      <w:tr>
+        <w:trPr>
+          <w:tblHeader w:val="off"/>
+        </w:trPr>
+        <w:tc>
+          <w:tcPr>
+            <w:tcW w:type="dxa" w:w="2700"/>
+            <w:tcMar>
+              <w:top w:type="dxa" w:w="60"/>
+              <w:left w:type="dxa" w:w="100"/>
+              <w:bottom w:type="dxa" w:w="60"/>
+              <w:right w:type="dxa" w:w="100"/>
+            </w:tcMar>
+            <w:vAlign w:val="top"/>
+          </w:tcPr>
+          <w:p>
+            <w:pPr>
+              <w:spacing w:after="60" w:before="40" w:line="300" w:lineRule="auto"/>
+            </w:pPr>
+            <w:r>
+              <w:rPr>
+                <w:rFonts w:ascii="Times New Roman" w:cs="Times New Roman" w:eastAsia="Times New Roman" w:hAnsi="Times New Roman"/>
+                <w:sz w:val="22"/>
+                <w:szCs w:val="22"/>
+              </w:rPr>
+              <w:t xml:space="preserve">boating (n)</w:t>
+            </w:r>
+          </w:p>
+        </w:tc>
+        <w:tc>
+          <w:tcPr>
+            <w:tcW w:type="dxa" w:w="2100"/>
+            <w:tcMar>
+              <w:top w:type="dxa" w:w="60"/>
+              <w:left w:type="dxa" w:w="100"/>
+              <w:bottom w:type="dxa" w:w="60"/>
+              <w:right w:type="dxa" w:w="100"/>
+            </w:tcMar>
+            <w:vAlign w:val="top"/>
+          </w:tcPr>
+          <w:p>
+            <w:pPr>
+              <w:spacing w:after="60" w:before="40" w:line="300" w:lineRule="auto"/>
+            </w:pPr>
+            <w:r>
+              <w:rPr>
+                <w:rFonts w:ascii="Times New Roman" w:cs="Times New Roman" w:eastAsia="Times New Roman" w:hAnsi="Times New Roman"/>
+                <w:sz w:val="22"/>
+                <w:szCs w:val="22"/>
+              </w:rPr>
+              <w:t xml:space="preserve">/ˈbəʊtɪŋ/</w:t>
+            </w:r>
+          </w:p>
+        </w:tc>
+        <w:tc>
+          <w:tcPr>
+            <w:tcW w:type="dxa" w:w="2555"/>
+            <w:tcMar>
+              <w:top w:type="dxa" w:w="60"/>
+              <w:left w:type="dxa" w:w="100"/>
+              <w:bottom w:type="dxa" w:w="60"/>
+              <w:right w:type="dxa" w:w="100"/>
+            </w:tcMar>
+            <w:vAlign w:val="top"/>
+          </w:tcPr>
+          <w:p>
+            <w:pPr>
+              <w:spacing w:after="60" w:before="40" w:line="300" w:lineRule="auto"/>
+            </w:pPr>
+            <w:r>
+              <w:rPr>
+                <w:rFonts w:ascii="Times New Roman" w:cs="Times New Roman" w:eastAsia="Times New Roman" w:hAnsi="Times New Roman"/>
+                <w:sz w:val="22"/>
+                <w:szCs w:val="22"/>
+              </w:rPr>
+              <w:t xml:space="preserve">going out in a small boat</w:t>
+            </w:r>
+          </w:p>
+        </w:tc>
+        <w:tc>
+          <w:tcPr>
+            <w:tcW w:type="dxa" w:w="2000"/>
+            <w:tcMar>
+              <w:top w:type="dxa" w:w="60"/>
+              <w:left w:type="dxa" w:w="100"/>
+              <w:bottom w:type="dxa" w:w="60"/>
+              <w:right w:type="dxa" w:w="100"/>
+            </w:tcMar>
+            <w:vAlign w:val="top"/>
+          </w:tcPr>
+          <w:p>
+            <w:pPr>
+              <w:spacing w:after="60" w:before="40" w:line="300" w:lineRule="auto"/>
+            </w:pPr>
+            <w:r>
+              <w:rPr>
+                <w:rFonts w:ascii="Times New Roman" w:cs="Times New Roman" w:eastAsia="Times New Roman" w:hAnsi="Times New Roman"/>
+                <w:sz w:val="22"/>
+                <w:szCs w:val="22"/>
+              </w:rPr>
+              <w:t xml:space="preserve">chèo thuyền</w:t>
+            </w:r>
+          </w:p>
+        </w:tc>
+      </w:tr>
+      <w:tr>
+        <w:trPr>
+          <w:tblHeader w:val="off"/>
+        </w:trPr>
+        <w:tc>
+          <w:tcPr>
+            <w:tcW w:type="dxa" w:w="2700"/>
+            <w:tcMar>
+              <w:top w:type="dxa" w:w="60"/>
+              <w:left w:type="dxa" w:w="100"/>
+              <w:bottom w:type="dxa" w:w="60"/>
+              <w:right w:type="dxa" w:w="100"/>
+            </w:tcMar>
+            <w:vAlign w:val="top"/>
+          </w:tcPr>
+          <w:p>
+            <w:pPr>
+              <w:spacing w:after="60" w:before="40" w:line="300" w:lineRule="auto"/>
+            </w:pPr>
+            <w:r>
+              <w:rPr>
+                <w:rFonts w:ascii="Times New Roman" w:cs="Times New Roman" w:eastAsia="Times New Roman" w:hAnsi="Times New Roman"/>
+                <w:sz w:val="22"/>
+                <w:szCs w:val="22"/>
+              </w:rPr>
+              <w:t xml:space="preserve">cycling (n)</w:t>
+            </w:r>
+          </w:p>
+        </w:tc>
+        <w:tc>
+          <w:tcPr>
+            <w:tcW w:type="dxa" w:w="2100"/>
+            <w:tcMar>
+              <w:top w:type="dxa" w:w="60"/>
+              <w:left w:type="dxa" w:w="100"/>
+              <w:bottom w:type="dxa" w:w="60"/>
+              <w:right w:type="dxa" w:w="100"/>
+            </w:tcMar>
+            <w:vAlign w:val="top"/>
+          </w:tcPr>
+          <w:p>
+            <w:pPr>
+              <w:spacing w:after="60" w:before="40" w:line="300" w:lineRule="auto"/>
+            </w:pPr>
+            <w:r>
+              <w:rPr>
+                <w:rFonts w:ascii="Times New Roman" w:cs="Times New Roman" w:eastAsia="Times New Roman" w:hAnsi="Times New Roman"/>
+                <w:sz w:val="22"/>
+                <w:szCs w:val="22"/>
+              </w:rPr>
+              <w:t xml:space="preserve">/ˈsaɪklɪŋ/</w:t>
+            </w:r>
+          </w:p>
+        </w:tc>
+        <w:tc>
+          <w:tcPr>
+            <w:tcW w:type="dxa" w:w="2555"/>
+            <w:tcMar>
+              <w:top w:type="dxa" w:w="60"/>
+              <w:left w:type="dxa" w:w="100"/>
+              <w:bottom w:type="dxa" w:w="60"/>
+              <w:right w:type="dxa" w:w="100"/>
+            </w:tcMar>
+            <w:vAlign w:val="top"/>
+          </w:tcPr>
+          <w:p>
+            <w:pPr>
+              <w:spacing w:after="60" w:before="40" w:line="300" w:lineRule="auto"/>
+            </w:pPr>
+            <w:r>
+              <w:rPr>
+                <w:rFonts w:ascii="Times New Roman" w:cs="Times New Roman" w:eastAsia="Times New Roman" w:hAnsi="Times New Roman"/>
+                <w:sz w:val="22"/>
+                <w:szCs w:val="22"/>
+              </w:rPr>
+              <w:t xml:space="preserve">riding a bicycle</w:t>
+            </w:r>
+          </w:p>
+        </w:tc>
+        <w:tc>
+          <w:tcPr>
+            <w:tcW w:type="dxa" w:w="2000"/>
+            <w:tcMar>
+              <w:top w:type="dxa" w:w="60"/>
+              <w:left w:type="dxa" w:w="100"/>
+              <w:bottom w:type="dxa" w:w="60"/>
+              <w:right w:type="dxa" w:w="100"/>
+            </w:tcMar>
+            <w:vAlign w:val="top"/>
+          </w:tcPr>
+          <w:p>
+            <w:pPr>
+              <w:spacing w:after="60" w:before="40" w:line="300" w:lineRule="auto"/>
+            </w:pPr>
+            <w:r>
+              <w:rPr>
+                <w:rFonts w:ascii="Times New Roman" w:cs="Times New Roman" w:eastAsia="Times New Roman" w:hAnsi="Times New Roman"/>
+                <w:sz w:val="22"/>
+                <w:szCs w:val="22"/>
+              </w:rPr>
+              <w:t xml:space="preserve">đạp xe</w:t>
+            </w:r>
+          </w:p>
+        </w:tc>
+      </w:tr>
+    </w:tbl>
+    <w:p>
+      <w:pPr>
+        <w:keepNext/>
+        <w:spacing w:after="80" w:before="120" w:line="300" w:lineRule="auto"/>
+      </w:pPr>
+      <w:r>
+        <w:rPr>
+          <w:rFonts w:ascii="Times New Roman" w:cs="Times New Roman" w:eastAsia="Times New Roman" w:hAnsi="Times New Roman"/>
+          <w:b/>
+          <w:bCs/>
+          <w:sz w:val="26"/>
+          <w:szCs w:val="26"/>
+        </w:rPr>
+        <w:t xml:space="preserve">Kế hoạch bảng (Board plan)</w:t>
+      </w:r>
+    </w:p>
+    <w:tbl>
+      <w:tblPr>
+        <w:tblW w:type="dxa" w:w="9355"/>
+        <w:tblBorders>
+          <w:top w:val="single" w:color="808080" w:sz="4"/>
+          <w:left w:val="single" w:color="808080" w:sz="4"/>
+          <w:bottom w:val="single" w:color="808080" w:sz="4"/>
+          <w:right w:val="single" w:color="808080" w:sz="4"/>
+          <w:insideH w:val="single" w:color="808080" w:sz="4"/>
+          <w:insideV w:val="single" w:color="808080" w:sz="4"/>
+        </w:tblBorders>
+      </w:tblPr>
+      <w:tblGrid>
+        <w:gridCol w:w="9355"/>
+      </w:tblGrid>
+      <w:tr>
+        <w:trPr>
+          <w:tblHeader w:val="off"/>
+        </w:trPr>
+        <w:tc>
+          <w:tcPr>
+            <w:tcW w:type="dxa" w:w="9355"/>
+            <w:tcMar>
+              <w:top w:type="dxa" w:w="60"/>
+              <w:left w:type="dxa" w:w="100"/>
+              <w:bottom w:type="dxa" w:w="60"/>
+              <w:right w:type="dxa" w:w="100"/>
+            </w:tcMar>
+            <w:vAlign w:val="top"/>
+          </w:tcPr>
+          <w:p>
+            <w:pPr>
+              <w:spacing w:after="20" w:before="0" w:line="300" w:lineRule="auto"/>
+            </w:pPr>
+            <w:r>
+              <w:rPr>
+                <w:rFonts w:ascii="Times New Roman" w:cs="Times New Roman" w:eastAsia="Times New Roman" w:hAnsi="Times New Roman"/>
+                <w:sz w:val="22"/>
+                <w:szCs w:val="22"/>
+              </w:rPr>
+              <w:t xml:space="preserve">Date of teaching: ……</w:t>
+            </w:r>
+          </w:p>
+          <w:p>
+            <w:pPr>
+              <w:spacing w:after="20" w:before="0" w:line="300" w:lineRule="auto"/>
+            </w:pPr>
+            <w:r>
+              <w:rPr>
+                <w:rFonts w:ascii="Times New Roman" w:cs="Times New Roman" w:eastAsia="Times New Roman" w:hAnsi="Times New Roman"/>
+                <w:sz w:val="22"/>
+                <w:szCs w:val="22"/>
+              </w:rPr>
+              <w:t xml:space="preserve">Unit 2: Healthy living – Lesson 1: Getting started – Let's go out!</w:t>
+            </w:r>
+          </w:p>
+          <w:p>
+            <w:pPr>
+              <w:spacing w:after="20" w:before="0" w:line="300" w:lineRule="auto"/>
+            </w:pPr>
+            <w:r>
+              <w:rPr>
+                <w:rFonts w:ascii="Times New Roman" w:cs="Times New Roman" w:eastAsia="Times New Roman" w:hAnsi="Times New Roman"/>
+                <w:sz w:val="22"/>
+                <w:szCs w:val="22"/>
+              </w:rPr>
+              <w:t xml:space="preserve">Warm-up: Brainstorming – HEALTH</w:t>
+            </w:r>
+          </w:p>
+          <w:p>
+            <w:pPr>
+              <w:spacing w:after="20" w:before="0" w:line="300" w:lineRule="auto"/>
+            </w:pPr>
+            <w:r>
+              <w:rPr>
+                <w:rFonts w:ascii="Times New Roman" w:cs="Times New Roman" w:eastAsia="Times New Roman" w:hAnsi="Times New Roman"/>
+                <w:sz w:val="22"/>
+                <w:szCs w:val="22"/>
+              </w:rPr>
+              <w:t xml:space="preserve">I. Vocabulary: popular (a) phổ biến; fresh (a) tươi, mới; join (v) tham gia</w:t>
+            </w:r>
+          </w:p>
+          <w:p>
+            <w:pPr>
+              <w:spacing w:after="20" w:before="0" w:line="300" w:lineRule="auto"/>
+            </w:pPr>
+            <w:r>
+              <w:rPr>
+                <w:rFonts w:ascii="Times New Roman" w:cs="Times New Roman" w:eastAsia="Times New Roman" w:hAnsi="Times New Roman"/>
+                <w:sz w:val="22"/>
+                <w:szCs w:val="22"/>
+              </w:rPr>
+              <w:t xml:space="preserve">II. Practice: Ex 2 – Tick; Ex 3 – Words under pictures; Ex 4 – Complete (p. 19)</w:t>
+            </w:r>
+          </w:p>
+          <w:p>
+            <w:pPr>
+              <w:spacing w:after="20" w:before="0" w:line="300" w:lineRule="auto"/>
+            </w:pPr>
+            <w:r>
+              <w:rPr>
+                <w:rFonts w:ascii="Times New Roman" w:cs="Times New Roman" w:eastAsia="Times New Roman" w:hAnsi="Times New Roman"/>
+                <w:sz w:val="22"/>
+                <w:szCs w:val="22"/>
+              </w:rPr>
+              <w:t xml:space="preserve">III. Production: Ex 5 – Survey: Good or bad for health</w:t>
+            </w:r>
+          </w:p>
+          <w:p>
+            <w:pPr>
+              <w:spacing w:after="20" w:before="0" w:line="300" w:lineRule="auto"/>
+            </w:pPr>
+            <w:r>
+              <w:rPr>
+                <w:rFonts w:ascii="Times New Roman" w:cs="Times New Roman" w:eastAsia="Times New Roman" w:hAnsi="Times New Roman"/>
+                <w:sz w:val="22"/>
+                <w:szCs w:val="22"/>
+              </w:rPr>
+              <w:t xml:space="preserve">Homework: learn new words; prepare A Closer Look 1</w:t>
+            </w:r>
+          </w:p>
+        </w:tc>
+      </w:tr>
+    </w:tbl>
     <w:p>
       <w:pPr>
         <w:keepNext/>
@@ -2688,6 +3891,22 @@
                 <w:rFonts w:ascii="Times New Roman" w:cs="Times New Roman" w:eastAsia="Times New Roman" w:hAnsi="Times New Roman"/>
                 <w:b/>
                 <w:bCs/>
+                <w:color w:val="1F3864"/>
+                <w:sz w:val="22"/>
+                <w:szCs w:val="22"/>
+              </w:rPr>
+              <w:t xml:space="preserve">WARM-UP</w:t>
+            </w:r>
+          </w:p>
+          <w:p>
+            <w:pPr>
+              <w:spacing w:after="60" w:before="40" w:line="300" w:lineRule="auto"/>
+            </w:pPr>
+            <w:r>
+              <w:rPr>
+                <w:rFonts w:ascii="Times New Roman" w:cs="Times New Roman" w:eastAsia="Times New Roman" w:hAnsi="Times New Roman"/>
+                <w:b w:val="false"/>
+                <w:bCs w:val="false"/>
                 <w:sz w:val="22"/>
                 <w:szCs w:val="22"/>
               </w:rPr>
@@ -3066,6 +4285,22 @@
                 <w:rFonts w:ascii="Times New Roman" w:cs="Times New Roman" w:eastAsia="Times New Roman" w:hAnsi="Times New Roman"/>
                 <w:b/>
                 <w:bCs/>
+                <w:color w:val="1F3864"/>
+                <w:sz w:val="22"/>
+                <w:szCs w:val="22"/>
+              </w:rPr>
+              <w:t xml:space="preserve">PRESENTATION</w:t>
+            </w:r>
+          </w:p>
+          <w:p>
+            <w:pPr>
+              <w:spacing w:after="60" w:before="40" w:line="300" w:lineRule="auto"/>
+            </w:pPr>
+            <w:r>
+              <w:rPr>
+                <w:rFonts w:ascii="Times New Roman" w:cs="Times New Roman" w:eastAsia="Times New Roman" w:hAnsi="Times New Roman"/>
+                <w:b w:val="false"/>
+                <w:bCs w:val="false"/>
                 <w:sz w:val="22"/>
                 <w:szCs w:val="22"/>
               </w:rPr>
@@ -3188,44 +4423,14 @@
               <w:t xml:space="preserve">Đoán nghĩa popular (trái nghĩa), fresh </w:t>
             </w:r>
             <w:r>
-              <w:drawing>
-                <wp:inline distT="0" distB="0" distL="0" distR="0">
-                  <wp:extent cx="1047750" cy="1047750"/>
-                  <wp:effectExtent t="0" r="0" b="0" l="0"/>
-                  <wp:docPr id="1" name="" descr="" title=""/>
-                  <wp:cNvGraphicFramePr>
-                    <a:graphicFrameLocks xmlns:a="http://schemas.openxmlformats.org/drawingml/2006/main" noChangeAspect="1"/>
-                  </wp:cNvGraphicFramePr>
-                  <a:graphic xmlns:a="http://schemas.openxmlformats.org/drawingml/2006/main">
-                    <a:graphicData uri="http://schemas.openxmlformats.org/drawingml/2006/picture">
-                      <pic:pic xmlns:pic="http://schemas.openxmlformats.org/drawingml/2006/picture">
-                        <pic:nvPicPr>
-                          <pic:cNvPr id="0" name="" descr=""/>
-                          <pic:cNvPicPr>
-                            <a:picLocks noChangeAspect="1" noChangeArrowheads="1"/>
-                          </pic:cNvPicPr>
-                        </pic:nvPicPr>
-                        <pic:blipFill>
-                          <a:blip r:embed="rId7" cstate="none"/>
-                          <a:srcRect/>
-                          <a:stretch>
-                            <a:fillRect/>
-                          </a:stretch>
-                        </pic:blipFill>
-                        <pic:spPr bwMode="auto">
-                          <a:xfrm>
-                            <a:off x="0" y="0"/>
-                            <a:ext cx="1047750" cy="1047750"/>
-                          </a:xfrm>
-                          <a:prstGeom prst="rect">
-                            <a:avLst/>
-                          </a:prstGeom>
-                        </pic:spPr>
-                      </pic:pic>
-                    </a:graphicData>
-                  </a:graphic>
-                </wp:inline>
-              </w:drawing>
+              <w:rPr>
+                <w:rFonts w:ascii="Times New Roman" w:cs="Times New Roman" w:eastAsia="Times New Roman" w:hAnsi="Times New Roman"/>
+                <w:i/>
+                <w:iCs/>
+                <w:sz w:val="22"/>
+                <w:szCs w:val="22"/>
+              </w:rPr>
+              <w:t xml:space="preserve">(hình 1 trong giáo án gốc)</w:t>
             </w:r>
             <w:r>
               <w:rPr>
@@ -3236,44 +4441,14 @@
               <w:t xml:space="preserve">, join </w:t>
             </w:r>
             <w:r>
-              <w:drawing>
-                <wp:inline distT="0" distB="0" distL="0" distR="0">
-                  <wp:extent cx="1047750" cy="1047750"/>
-                  <wp:effectExtent t="0" r="0" b="0" l="0"/>
-                  <wp:docPr id="2" name="" descr="" title=""/>
-                  <wp:cNvGraphicFramePr>
-                    <a:graphicFrameLocks xmlns:a="http://schemas.openxmlformats.org/drawingml/2006/main" noChangeAspect="1"/>
-                  </wp:cNvGraphicFramePr>
-                  <a:graphic xmlns:a="http://schemas.openxmlformats.org/drawingml/2006/main">
-                    <a:graphicData uri="http://schemas.openxmlformats.org/drawingml/2006/picture">
-                      <pic:pic xmlns:pic="http://schemas.openxmlformats.org/drawingml/2006/picture">
-                        <pic:nvPicPr>
-                          <pic:cNvPr id="0" name="" descr=""/>
-                          <pic:cNvPicPr>
-                            <a:picLocks noChangeAspect="1" noChangeArrowheads="1"/>
-                          </pic:cNvPicPr>
-                        </pic:nvPicPr>
-                        <pic:blipFill>
-                          <a:blip r:embed="rId8" cstate="none"/>
-                          <a:srcRect/>
-                          <a:stretch>
-                            <a:fillRect/>
-                          </a:stretch>
-                        </pic:blipFill>
-                        <pic:spPr bwMode="auto">
-                          <a:xfrm>
-                            <a:off x="0" y="0"/>
-                            <a:ext cx="1047750" cy="1047750"/>
-                          </a:xfrm>
-                          <a:prstGeom prst="rect">
-                            <a:avLst/>
-                          </a:prstGeom>
-                        </pic:spPr>
-                      </pic:pic>
-                    </a:graphicData>
-                  </a:graphic>
-                </wp:inline>
-              </w:drawing>
+              <w:rPr>
+                <w:rFonts w:ascii="Times New Roman" w:cs="Times New Roman" w:eastAsia="Times New Roman" w:hAnsi="Times New Roman"/>
+                <w:i/>
+                <w:iCs/>
+                <w:sz w:val="22"/>
+                <w:szCs w:val="22"/>
+              </w:rPr>
+              <w:t xml:space="preserve">(hình 2 trong giáo án gốc)</w:t>
             </w:r>
             <w:r>
               <w:rPr>
@@ -3548,6 +4723,22 @@
                 <w:rFonts w:ascii="Times New Roman" w:cs="Times New Roman" w:eastAsia="Times New Roman" w:hAnsi="Times New Roman"/>
                 <w:b/>
                 <w:bCs/>
+                <w:color w:val="1F3864"/>
+                <w:sz w:val="22"/>
+                <w:szCs w:val="22"/>
+              </w:rPr>
+              <w:t xml:space="preserve">PRACTICE</w:t>
+            </w:r>
+          </w:p>
+          <w:p>
+            <w:pPr>
+              <w:spacing w:after="60" w:before="40" w:line="300" w:lineRule="auto"/>
+            </w:pPr>
+            <w:r>
+              <w:rPr>
+                <w:rFonts w:ascii="Times New Roman" w:cs="Times New Roman" w:eastAsia="Times New Roman" w:hAnsi="Times New Roman"/>
+                <w:b w:val="false"/>
+                <w:bCs w:val="false"/>
                 <w:sz w:val="22"/>
                 <w:szCs w:val="22"/>
               </w:rPr>
@@ -3934,6 +5125,22 @@
                 <w:rFonts w:ascii="Times New Roman" w:cs="Times New Roman" w:eastAsia="Times New Roman" w:hAnsi="Times New Roman"/>
                 <w:b/>
                 <w:bCs/>
+                <w:color w:val="1F3864"/>
+                <w:sz w:val="22"/>
+                <w:szCs w:val="22"/>
+              </w:rPr>
+              <w:t xml:space="preserve">PRACTICE</w:t>
+            </w:r>
+          </w:p>
+          <w:p>
+            <w:pPr>
+              <w:spacing w:after="60" w:before="40" w:line="300" w:lineRule="auto"/>
+            </w:pPr>
+            <w:r>
+              <w:rPr>
+                <w:rFonts w:ascii="Times New Roman" w:cs="Times New Roman" w:eastAsia="Times New Roman" w:hAnsi="Times New Roman"/>
+                <w:b w:val="false"/>
+                <w:bCs w:val="false"/>
                 <w:sz w:val="22"/>
                 <w:szCs w:val="22"/>
               </w:rPr>
@@ -4248,6 +5455,22 @@
                 <w:rFonts w:ascii="Times New Roman" w:cs="Times New Roman" w:eastAsia="Times New Roman" w:hAnsi="Times New Roman"/>
                 <w:b/>
                 <w:bCs/>
+                <w:color w:val="1F3864"/>
+                <w:sz w:val="22"/>
+                <w:szCs w:val="22"/>
+              </w:rPr>
+              <w:t xml:space="preserve">PRODUCTION</w:t>
+            </w:r>
+          </w:p>
+          <w:p>
+            <w:pPr>
+              <w:spacing w:after="60" w:before="40" w:line="300" w:lineRule="auto"/>
+            </w:pPr>
+            <w:r>
+              <w:rPr>
+                <w:rFonts w:ascii="Times New Roman" w:cs="Times New Roman" w:eastAsia="Times New Roman" w:hAnsi="Times New Roman"/>
+                <w:b w:val="false"/>
+                <w:bCs w:val="false"/>
                 <w:sz w:val="22"/>
                 <w:szCs w:val="22"/>
               </w:rPr>
@@ -4626,6 +5849,22 @@
                 <w:rFonts w:ascii="Times New Roman" w:cs="Times New Roman" w:eastAsia="Times New Roman" w:hAnsi="Times New Roman"/>
                 <w:b/>
                 <w:bCs/>
+                <w:color w:val="1F3864"/>
+                <w:sz w:val="22"/>
+                <w:szCs w:val="22"/>
+              </w:rPr>
+              <w:t xml:space="preserve">PRODUCTION</w:t>
+            </w:r>
+          </w:p>
+          <w:p>
+            <w:pPr>
+              <w:spacing w:after="60" w:before="40" w:line="300" w:lineRule="auto"/>
+            </w:pPr>
+            <w:r>
+              <w:rPr>
+                <w:rFonts w:ascii="Times New Roman" w:cs="Times New Roman" w:eastAsia="Times New Roman" w:hAnsi="Times New Roman"/>
+                <w:b w:val="false"/>
+                <w:bCs w:val="false"/>
                 <w:sz w:val="22"/>
                 <w:szCs w:val="22"/>
               </w:rPr>
@@ -5004,6 +6243,22 @@
                 <w:rFonts w:ascii="Times New Roman" w:cs="Times New Roman" w:eastAsia="Times New Roman" w:hAnsi="Times New Roman"/>
                 <w:b/>
                 <w:bCs/>
+                <w:color w:val="1F3864"/>
+                <w:sz w:val="22"/>
+                <w:szCs w:val="22"/>
+              </w:rPr>
+              <w:t xml:space="preserve">REFLECTION</w:t>
+            </w:r>
+          </w:p>
+          <w:p>
+            <w:pPr>
+              <w:spacing w:after="60" w:before="40" w:line="300" w:lineRule="auto"/>
+            </w:pPr>
+            <w:r>
+              <w:rPr>
+                <w:rFonts w:ascii="Times New Roman" w:cs="Times New Roman" w:eastAsia="Times New Roman" w:hAnsi="Times New Roman"/>
+                <w:b w:val="false"/>
+                <w:bCs w:val="false"/>
                 <w:sz w:val="22"/>
                 <w:szCs w:val="22"/>
               </w:rPr>
@@ -5426,6 +6681,22 @@
                 <w:rFonts w:ascii="Times New Roman" w:cs="Times New Roman" w:eastAsia="Times New Roman" w:hAnsi="Times New Roman"/>
                 <w:b/>
                 <w:bCs/>
+                <w:color w:val="1F3864"/>
+                <w:sz w:val="22"/>
+                <w:szCs w:val="22"/>
+              </w:rPr>
+              <w:t xml:space="preserve">CONSOLIDATION</w:t>
+            </w:r>
+          </w:p>
+          <w:p>
+            <w:pPr>
+              <w:spacing w:after="60" w:before="40" w:line="300" w:lineRule="auto"/>
+            </w:pPr>
+            <w:r>
+              <w:rPr>
+                <w:rFonts w:ascii="Times New Roman" w:cs="Times New Roman" w:eastAsia="Times New Roman" w:hAnsi="Times New Roman"/>
+                <w:b w:val="false"/>
+                <w:bCs w:val="false"/>
                 <w:sz w:val="22"/>
                 <w:szCs w:val="22"/>
               </w:rPr>
@@ -5740,75 +7011,254 @@
           <w:sz w:val="28"/>
           <w:szCs w:val="28"/>
         </w:rPr>
-        <w:t xml:space="preserve">IV. DỰ KIẾN KHÓ KHĂN VÀ GIẢI PHÁP</w:t>
+        <w:t xml:space="preserve">IV. DỰ KIẾN KHÓ KHĂN VÀ GIẢI PHÁP (ASSUMPTIONS)</w:t>
       </w:r>
     </w:p>
-    <w:p>
-      <w:pPr>
-        <w:spacing w:after="60" w:before="40" w:line="300" w:lineRule="auto"/>
-        <w:ind w:left="284"/>
-      </w:pPr>
-      <w:r>
-        <w:rPr>
-          <w:rFonts w:ascii="Times New Roman" w:cs="Times New Roman" w:eastAsia="Times New Roman" w:hAnsi="Times New Roman"/>
-          <w:sz w:val="26"/>
-          <w:szCs w:val="26"/>
-        </w:rPr>
-        <w:t xml:space="preserve">– </w:t>
-      </w:r>
-      <w:r>
-        <w:rPr>
-          <w:rFonts w:ascii="Times New Roman" w:cs="Times New Roman" w:eastAsia="Times New Roman" w:hAnsi="Times New Roman"/>
-          <w:sz w:val="26"/>
-          <w:szCs w:val="26"/>
-        </w:rPr>
-        <w:t xml:space="preserve">HS thiếu vốn từ, trải nghiệm chủ đề → Tranh, handout, khung câu</w:t>
-      </w:r>
-    </w:p>
-    <w:p>
-      <w:pPr>
-        <w:spacing w:after="60" w:before="40" w:line="300" w:lineRule="auto"/>
-        <w:ind w:left="284"/>
-      </w:pPr>
-      <w:r>
-        <w:rPr>
-          <w:rFonts w:ascii="Times New Roman" w:cs="Times New Roman" w:eastAsia="Times New Roman" w:hAnsi="Times New Roman"/>
-          <w:sz w:val="26"/>
-          <w:szCs w:val="26"/>
-        </w:rPr>
-        <w:t xml:space="preserve">– </w:t>
-      </w:r>
-      <w:r>
-        <w:rPr>
-          <w:rFonts w:ascii="Times New Roman" w:cs="Times New Roman" w:eastAsia="Times New Roman" w:hAnsi="Times New Roman"/>
-          <w:sz w:val="26"/>
-          <w:szCs w:val="26"/>
-        </w:rPr>
-        <w:t xml:space="preserve">HS yếu nghe, nói, hợp tác → Nghe lại; ghép khá – yếu; phân vai</w:t>
-      </w:r>
-    </w:p>
-    <w:p>
-      <w:pPr>
-        <w:spacing w:after="60" w:before="40" w:line="300" w:lineRule="auto"/>
-        <w:ind w:left="284"/>
-      </w:pPr>
-      <w:r>
-        <w:rPr>
-          <w:rFonts w:ascii="Times New Roman" w:cs="Times New Roman" w:eastAsia="Times New Roman" w:hAnsi="Times New Roman"/>
-          <w:sz w:val="26"/>
-          <w:szCs w:val="26"/>
-        </w:rPr>
-        <w:t xml:space="preserve">– </w:t>
-      </w:r>
-      <w:r>
-        <w:rPr>
-          <w:rFonts w:ascii="Times New Roman" w:cs="Times New Roman" w:eastAsia="Times New Roman" w:hAnsi="Times New Roman"/>
-          <w:sz w:val="26"/>
-          <w:szCs w:val="26"/>
-        </w:rPr>
-        <w:t xml:space="preserve">Nhóm làm poster quá giờ → Timekeeper; báo mốc còn 2 phút</w:t>
-      </w:r>
-    </w:p>
+    <w:tbl>
+      <w:tblPr>
+        <w:tblW w:type="dxa" w:w="9355"/>
+        <w:tblBorders>
+          <w:top w:val="single" w:color="808080" w:sz="4"/>
+          <w:left w:val="single" w:color="808080" w:sz="4"/>
+          <w:bottom w:val="single" w:color="808080" w:sz="4"/>
+          <w:right w:val="single" w:color="808080" w:sz="4"/>
+          <w:insideH w:val="single" w:color="808080" w:sz="4"/>
+          <w:insideV w:val="single" w:color="808080" w:sz="4"/>
+        </w:tblBorders>
+      </w:tblPr>
+      <w:tblGrid>
+        <w:gridCol w:w="4677"/>
+        <w:gridCol w:w="4678"/>
+      </w:tblGrid>
+      <w:tr>
+        <w:trPr>
+          <w:tblHeader/>
+        </w:trPr>
+        <w:tc>
+          <w:tcPr>
+            <w:tcW w:type="dxa" w:w="4677"/>
+            <w:shd w:fill="D9E2F3" w:color="auto" w:val="clear"/>
+            <w:tcMar>
+              <w:top w:type="dxa" w:w="60"/>
+              <w:left w:type="dxa" w:w="100"/>
+              <w:bottom w:type="dxa" w:w="60"/>
+              <w:right w:type="dxa" w:w="100"/>
+            </w:tcMar>
+            <w:vAlign w:val="top"/>
+          </w:tcPr>
+          <w:p>
+            <w:pPr>
+              <w:spacing w:after="60" w:before="40" w:line="300" w:lineRule="auto"/>
+              <w:jc w:val="center"/>
+            </w:pPr>
+            <w:r>
+              <w:rPr>
+                <w:rFonts w:ascii="Times New Roman" w:cs="Times New Roman" w:eastAsia="Times New Roman" w:hAnsi="Times New Roman"/>
+                <w:b/>
+                <w:bCs/>
+                <w:sz w:val="24"/>
+                <w:szCs w:val="24"/>
+              </w:rPr>
+              <w:t xml:space="preserve">Anticipated difficulties</w:t>
+            </w:r>
+          </w:p>
+        </w:tc>
+        <w:tc>
+          <w:tcPr>
+            <w:tcW w:type="dxa" w:w="4678"/>
+            <w:shd w:fill="D9E2F3" w:color="auto" w:val="clear"/>
+            <w:tcMar>
+              <w:top w:type="dxa" w:w="60"/>
+              <w:left w:type="dxa" w:w="100"/>
+              <w:bottom w:type="dxa" w:w="60"/>
+              <w:right w:type="dxa" w:w="100"/>
+            </w:tcMar>
+            <w:vAlign w:val="top"/>
+          </w:tcPr>
+          <w:p>
+            <w:pPr>
+              <w:spacing w:after="60" w:before="40" w:line="300" w:lineRule="auto"/>
+              <w:jc w:val="center"/>
+            </w:pPr>
+            <w:r>
+              <w:rPr>
+                <w:rFonts w:ascii="Times New Roman" w:cs="Times New Roman" w:eastAsia="Times New Roman" w:hAnsi="Times New Roman"/>
+                <w:b/>
+                <w:bCs/>
+                <w:sz w:val="24"/>
+                <w:szCs w:val="24"/>
+              </w:rPr>
+              <w:t xml:space="preserve">Solutions</w:t>
+            </w:r>
+          </w:p>
+        </w:tc>
+      </w:tr>
+      <w:tr>
+        <w:trPr>
+          <w:tblHeader w:val="off"/>
+        </w:trPr>
+        <w:tc>
+          <w:tcPr>
+            <w:tcW w:type="dxa" w:w="4677"/>
+            <w:tcMar>
+              <w:top w:type="dxa" w:w="60"/>
+              <w:left w:type="dxa" w:w="100"/>
+              <w:bottom w:type="dxa" w:w="60"/>
+              <w:right w:type="dxa" w:w="100"/>
+            </w:tcMar>
+            <w:vAlign w:val="top"/>
+          </w:tcPr>
+          <w:p>
+            <w:pPr>
+              <w:spacing w:after="60" w:before="40" w:line="300" w:lineRule="auto"/>
+            </w:pPr>
+            <w:r>
+              <w:rPr>
+                <w:rFonts w:ascii="Times New Roman" w:cs="Times New Roman" w:eastAsia="Times New Roman" w:hAnsi="Times New Roman"/>
+                <w:sz w:val="22"/>
+                <w:szCs w:val="22"/>
+              </w:rPr>
+              <w:t xml:space="preserve">HS thiếu vốn từ, trải nghiệm chủ đề</w:t>
+            </w:r>
+          </w:p>
+        </w:tc>
+        <w:tc>
+          <w:tcPr>
+            <w:tcW w:type="dxa" w:w="4678"/>
+            <w:tcMar>
+              <w:top w:type="dxa" w:w="60"/>
+              <w:left w:type="dxa" w:w="100"/>
+              <w:bottom w:type="dxa" w:w="60"/>
+              <w:right w:type="dxa" w:w="100"/>
+            </w:tcMar>
+            <w:vAlign w:val="top"/>
+          </w:tcPr>
+          <w:p>
+            <w:pPr>
+              <w:spacing w:after="60" w:before="40" w:line="300" w:lineRule="auto"/>
+            </w:pPr>
+            <w:r>
+              <w:rPr>
+                <w:rFonts w:ascii="Times New Roman" w:cs="Times New Roman" w:eastAsia="Times New Roman" w:hAnsi="Times New Roman"/>
+                <w:sz w:val="22"/>
+                <w:szCs w:val="22"/>
+              </w:rPr>
+              <w:t xml:space="preserve">Tranh, handout, khung câu</w:t>
+            </w:r>
+          </w:p>
+        </w:tc>
+      </w:tr>
+      <w:tr>
+        <w:trPr>
+          <w:tblHeader w:val="off"/>
+        </w:trPr>
+        <w:tc>
+          <w:tcPr>
+            <w:tcW w:type="dxa" w:w="4677"/>
+            <w:tcMar>
+              <w:top w:type="dxa" w:w="60"/>
+              <w:left w:type="dxa" w:w="100"/>
+              <w:bottom w:type="dxa" w:w="60"/>
+              <w:right w:type="dxa" w:w="100"/>
+            </w:tcMar>
+            <w:vAlign w:val="top"/>
+          </w:tcPr>
+          <w:p>
+            <w:pPr>
+              <w:spacing w:after="60" w:before="40" w:line="300" w:lineRule="auto"/>
+            </w:pPr>
+            <w:r>
+              <w:rPr>
+                <w:rFonts w:ascii="Times New Roman" w:cs="Times New Roman" w:eastAsia="Times New Roman" w:hAnsi="Times New Roman"/>
+                <w:sz w:val="22"/>
+                <w:szCs w:val="22"/>
+              </w:rPr>
+              <w:t xml:space="preserve">HS yếu nghe, nói, hợp tác</w:t>
+            </w:r>
+          </w:p>
+        </w:tc>
+        <w:tc>
+          <w:tcPr>
+            <w:tcW w:type="dxa" w:w="4678"/>
+            <w:tcMar>
+              <w:top w:type="dxa" w:w="60"/>
+              <w:left w:type="dxa" w:w="100"/>
+              <w:bottom w:type="dxa" w:w="60"/>
+              <w:right w:type="dxa" w:w="100"/>
+            </w:tcMar>
+            <w:vAlign w:val="top"/>
+          </w:tcPr>
+          <w:p>
+            <w:pPr>
+              <w:spacing w:after="60" w:before="40" w:line="300" w:lineRule="auto"/>
+            </w:pPr>
+            <w:r>
+              <w:rPr>
+                <w:rFonts w:ascii="Times New Roman" w:cs="Times New Roman" w:eastAsia="Times New Roman" w:hAnsi="Times New Roman"/>
+                <w:sz w:val="22"/>
+                <w:szCs w:val="22"/>
+              </w:rPr>
+              <w:t xml:space="preserve">Nghe lại; ghép khá – yếu; phân vai</w:t>
+            </w:r>
+          </w:p>
+        </w:tc>
+      </w:tr>
+      <w:tr>
+        <w:trPr>
+          <w:tblHeader w:val="off"/>
+        </w:trPr>
+        <w:tc>
+          <w:tcPr>
+            <w:tcW w:type="dxa" w:w="4677"/>
+            <w:tcMar>
+              <w:top w:type="dxa" w:w="60"/>
+              <w:left w:type="dxa" w:w="100"/>
+              <w:bottom w:type="dxa" w:w="60"/>
+              <w:right w:type="dxa" w:w="100"/>
+            </w:tcMar>
+            <w:vAlign w:val="top"/>
+          </w:tcPr>
+          <w:p>
+            <w:pPr>
+              <w:spacing w:after="60" w:before="40" w:line="300" w:lineRule="auto"/>
+            </w:pPr>
+            <w:r>
+              <w:rPr>
+                <w:rFonts w:ascii="Times New Roman" w:cs="Times New Roman" w:eastAsia="Times New Roman" w:hAnsi="Times New Roman"/>
+                <w:sz w:val="22"/>
+                <w:szCs w:val="22"/>
+              </w:rPr>
+              <w:t xml:space="preserve">Nhóm làm poster quá giờ</w:t>
+            </w:r>
+          </w:p>
+        </w:tc>
+        <w:tc>
+          <w:tcPr>
+            <w:tcW w:type="dxa" w:w="4678"/>
+            <w:tcMar>
+              <w:top w:type="dxa" w:w="60"/>
+              <w:left w:type="dxa" w:w="100"/>
+              <w:bottom w:type="dxa" w:w="60"/>
+              <w:right w:type="dxa" w:w="100"/>
+            </w:tcMar>
+            <w:vAlign w:val="top"/>
+          </w:tcPr>
+          <w:p>
+            <w:pPr>
+              <w:spacing w:after="60" w:before="40" w:line="300" w:lineRule="auto"/>
+            </w:pPr>
+            <w:r>
+              <w:rPr>
+                <w:rFonts w:ascii="Times New Roman" w:cs="Times New Roman" w:eastAsia="Times New Roman" w:hAnsi="Times New Roman"/>
+                <w:sz w:val="22"/>
+                <w:szCs w:val="22"/>
+              </w:rPr>
+              <w:t xml:space="preserve">Timekeeper; báo mốc còn 2 phút</w:t>
+            </w:r>
+          </w:p>
+        </w:tc>
+      </w:tr>
+    </w:tbl>
     <w:p>
       <w:pPr>
         <w:keepNext/>
@@ -5822,7 +7272,7 @@
           <w:sz w:val="28"/>
           <w:szCs w:val="28"/>
         </w:rPr>
-        <w:t xml:space="preserve">V. HƯỚNG DẪN TỰ HỌC Ở NHÀ</w:t>
+        <w:t xml:space="preserve">V. HƯỚNG DẪN VỀ NHÀ (HOMEWORK)</w:t>
       </w:r>
     </w:p>
     <w:p>

</xml_diff>